<commit_message>
Adding Goverence  checks, validation and  guardrails
</commit_message>
<xml_diff>
--- a/data/output/sops/sop_sem-jeol_20260526_1500.docx
+++ b/data/output/sops/sop_sem-jeol_20260526_1500.docx
@@ -59,7 +59,7 @@
                 <w:color w:val="CBD5E1"/>
                 <w:sz w:val="18"/>
               </w:rPr>
-              <w:t>Booking VEIN-0018   ·   Generated 2026-05-25 17:15</w:t>
+              <w:t>Booking VEIN-0053   ·   Generated 2026-05-25 21:58</w:t>
             </w:r>
           </w:p>
         </w:tc>
@@ -765,7 +765,7 @@
           <w:color w:val="3B6FB5"/>
           <w:sz w:val="18"/>
         </w:rPr>
-        <w:t>[Historical Run Log Run #8]</w:t>
+        <w:t>[Historical Run Log Run #13]</w:t>
       </w:r>
     </w:p>
     <w:p>
@@ -855,7 +855,7 @@
           <w:color w:val="3B6FB5"/>
           <w:sz w:val="18"/>
         </w:rPr>
-        <w:t>[Historical Run Log Run #8]</w:t>
+        <w:t>[Historical Run Log Run #13]</w:t>
       </w:r>
     </w:p>
     <w:p>
@@ -1239,7 +1239,7 @@
           <w:color w:val="3B6FB5"/>
           <w:sz w:val="18"/>
         </w:rPr>
-        <w:t>[Historical Run Log Run #8]</w:t>
+        <w:t>[Historical Run Log Run #13]</w:t>
       </w:r>
     </w:p>
     <w:p>
@@ -1333,7 +1333,7 @@
           <w:color w:val="1F2937"/>
           <w:sz w:val="20"/>
         </w:rPr>
-        <w:t>Historical Run Log — Run #8</w:t>
+        <w:t>Historical Run Log — Run #13</w:t>
       </w:r>
     </w:p>
     <w:p>
@@ -1356,7 +1356,7 @@
           <w:color w:val="1F2937"/>
           <w:sz w:val="20"/>
         </w:rPr>
-        <w:t>Historical Run Log — Run #6</w:t>
+        <w:t>Historical Run Log — Run #14</w:t>
       </w:r>
     </w:p>
     <w:p>
@@ -1379,7 +1379,7 @@
           <w:color w:val="1F2937"/>
           <w:sz w:val="20"/>
         </w:rPr>
-        <w:t>Historical Run Log — Run #7</w:t>
+        <w:t>Historical Run Log — Run #15</w:t>
       </w:r>
     </w:p>
     <w:p>
@@ -1402,7 +1402,7 @@
           <w:color w:val="1F2937"/>
           <w:sz w:val="20"/>
         </w:rPr>
-        <w:t>Historical Run Log — Run #9</w:t>
+        <w:t>Historical Run Log — Run #8</w:t>
       </w:r>
     </w:p>
     <w:p>
@@ -1425,7 +1425,7 @@
           <w:color w:val="1F2937"/>
           <w:sz w:val="20"/>
         </w:rPr>
-        <w:t>Historical Run Log — Run #5</w:t>
+        <w:t>Historical Run Log — Run #12</w:t>
       </w:r>
     </w:p>
     <w:p>
@@ -1448,7 +1448,7 @@
           <w:color w:val="1F2937"/>
           <w:sz w:val="20"/>
         </w:rPr>
-        <w:t>JEOL JSM-IT800 EDS/EBSD Attachment Guide — 6.1 EDS vs EBSD Selection (p.112)</w:t>
+        <w:t>Historical Run Log — Run #11</w:t>
       </w:r>
     </w:p>
     <w:p>
@@ -1471,7 +1471,7 @@
           <w:color w:val="1F2937"/>
           <w:sz w:val="20"/>
         </w:rPr>
-        <w:t>jeol-sem — jeol-sem</w:t>
+        <w:t>Historical Run Log — Run #6</w:t>
       </w:r>
     </w:p>
     <w:p>

</xml_diff>